<commit_message>
Final submission: Updated project code and fixes
</commit_message>
<xml_diff>
--- a/Buckeye_Marketplace_Admin_Guide.docx
+++ b/Buckeye_Marketplace_Admin_Guide.docx
@@ -44,10 +44,7 @@
         <w:spacing w:after="0"/>
       </w:pPr>
       <w:r>
-        <w:t>T</w:t>
-      </w:r>
-      <w:r>
-        <w:t>his guide provides administrators with the necessary steps to maintain the product catalog and oversee the fulfillment process within the Buckeye-Marketplace ecosystem.</w:t>
+        <w:t>This guide provides administrators with the necessary steps to maintain the product catalog and oversee the fulfillment process within the Buckeye-Marketplace ecosystem.</w:t>
       </w:r>
     </w:p>
     <w:p>
@@ -374,10 +371,7 @@
         <w:spacing w:after="0"/>
       </w:pPr>
       <w:r>
-        <w:t>E</w:t>
-      </w:r>
-      <w:r>
-        <w:t>fficient order management ensures transparency for the customer from the moment of purchase to final delivery.</w:t>
+        <w:t>Efficient order management ensures transparency for the customer from the moment of purchase to final delivery.</w:t>
       </w:r>
     </w:p>
     <w:p>
@@ -397,13 +391,7 @@
           <w:color w:val="6F6F6F"/>
         </w:rPr>
         <w:lastRenderedPageBreak/>
-        <w:t xml:space="preserve">1. </w:t>
-      </w:r>
-      <w:r>
-        <w:rPr>
-          <w:color w:val="6F6F6F"/>
-        </w:rPr>
-        <w:t>Accessing the Order Queue</w:t>
+        <w:t>1. Accessing the Order Queue</w:t>
       </w:r>
     </w:p>
     <w:p>

</xml_diff>